<commit_message>
Deployed 8c3205f with MkDocs version: 1.6.1
</commit_message>
<xml_diff>
--- a/Eurorack/201-Dual-Attenuverters/Files/manual.docx
+++ b/Eurorack/201-Dual-Attenuverters/Files/manual.docx
@@ -80,6 +80,17 @@
         <w:spacing w:line="360" w:lineRule="auto"/>
         <w:rPr>
           <w:rFonts w:ascii="Times New Roman" w:hAnsi="Times New Roman" w:cs="Times New Roman"/>
+          <w:b/>
+          <w:bCs/>
+          <w:lang w:val="en-US"/>
+        </w:rPr>
+      </w:pPr>
+    </w:p>
+    <w:p>
+      <w:pPr>
+        <w:spacing w:line="360" w:lineRule="auto"/>
+        <w:rPr>
+          <w:rFonts w:ascii="Times New Roman" w:hAnsi="Times New Roman" w:cs="Times New Roman"/>
           <w:lang w:val="en-US"/>
         </w:rPr>
       </w:pPr>
@@ -95,55 +106,7 @@
           <w:lang w:val="en-US"/>
         </w:rPr>
       </w:pPr>
-    </w:p>
-    <w:p>
-      <w:pPr>
-        <w:pStyle w:val="ListParagraph"/>
-        <w:numPr>
-          <w:ilvl w:val="1"/>
-          <w:numId w:val="1"/>
-        </w:numPr>
-        <w:spacing w:line="360" w:lineRule="auto"/>
-        <w:rPr>
-          <w:rFonts w:ascii="Times New Roman" w:hAnsi="Times New Roman" w:cs="Times New Roman"/>
-          <w:b/>
-          <w:bCs/>
-          <w:lang w:val="en-US"/>
-        </w:rPr>
-      </w:pPr>
-      <w:r>
-        <w:rPr>
-          <w:rFonts w:ascii="Times New Roman" w:hAnsi="Times New Roman" w:cs="Times New Roman"/>
-          <w:b/>
-          <w:bCs/>
-          <w:lang w:val="en-US"/>
-        </w:rPr>
-        <w:t>Features</w:t>
-      </w:r>
-    </w:p>
-    <w:p>
-      <w:pPr>
-        <w:spacing w:line="360" w:lineRule="auto"/>
-        <w:rPr>
-          <w:rFonts w:ascii="Times New Roman" w:hAnsi="Times New Roman" w:cs="Times New Roman"/>
-          <w:b/>
-          <w:bCs/>
-          <w:lang w:val="en-US"/>
-        </w:rPr>
-      </w:pPr>
-    </w:p>
-    <w:p>
-      <w:pPr>
-        <w:spacing w:line="360" w:lineRule="auto"/>
-        <w:rPr>
-          <w:rFonts w:ascii="Times New Roman" w:hAnsi="Times New Roman" w:cs="Times New Roman"/>
-          <w:lang w:val="en-US"/>
-        </w:rPr>
-      </w:pPr>
-    </w:p>
-    <w:p>
-      <w:pPr>
-        <w:spacing w:line="360" w:lineRule="auto"/>
+      <w:r>
         <w:rPr>
           <w:rFonts w:ascii="Times New Roman" w:hAnsi="Times New Roman" w:cs="Times New Roman"/>
           <w:b/>
@@ -151,15 +114,6 @@
           <w:u w:val="single"/>
           <w:lang w:val="en-US"/>
         </w:rPr>
-      </w:pPr>
-      <w:r>
-        <w:rPr>
-          <w:rFonts w:ascii="Times New Roman" w:hAnsi="Times New Roman" w:cs="Times New Roman"/>
-          <w:b/>
-          <w:bCs/>
-          <w:u w:val="single"/>
-          <w:lang w:val="en-US"/>
-        </w:rPr>
         <w:t>2 Installation &amp; Power</w:t>
       </w:r>
     </w:p>
@@ -375,14 +329,7 @@
           <w:rFonts w:ascii="Times New Roman" w:hAnsi="Times New Roman" w:cs="Times New Roman"/>
           <w:lang w:val="en-US"/>
         </w:rPr>
-        <w:t xml:space="preserve"> </w:t>
-      </w:r>
-      <w:r>
-        <w:rPr>
-          <w:rFonts w:ascii="Times New Roman" w:hAnsi="Times New Roman" w:cs="Times New Roman"/>
-          <w:lang w:val="en-US"/>
-        </w:rPr>
-        <w:t>heavily</w:t>
+        <w:t xml:space="preserve"> heavily</w:t>
       </w:r>
       <w:r>
         <w:rPr>

</xml_diff>